<commit_message>
chgk: a handout on its own lines is set as a captioned box in docx and PDF
Ports chgksuite's handout box (handout-table branch): the caption, small, then
the handout in a 1pt frame, a two-row table in docx and a stroked block in
typst. The docx reader reads that table back as the handout bracket in the
block form, so 4s -> docx -> 4s is unchanged; chgkimport's round-trip test
pins it. The docx oracles are regenerated from chgksuite with the change.

Also: the handout fix-up in textparse no longer rewrites a handout whose text
opens with a bracket, and the docx tests read text with encoding/xml instead
of a regex that also matched <w:tbl>.

Co-Authored-By: Claude Opus 5.5 <noreply@anthropic.com>
</commit_message>
<xml_diff>
--- a/xy/internal/chgk/docx/testdata/basic.docx
+++ b/xy/internal/chgk/docx/testdata/basic.docx
@@ -80,14 +80,19 @@
     <w:p>
       <w:pPr>
         <w:keepLines/>
+        <w:spacing w:before="46"/>
       </w:pPr>
       <w:r>
         <w:rPr>
           <w:b/>
+          <w:sz w:val="20"/>
         </w:rPr>
         <w:t xml:space="preserve">Источник: </w:t>
       </w:r>
       <w:r>
+        <w:rPr>
+          <w:sz w:val="20"/>
+        </w:rPr>
         <w:t>Арифметика</w:t>
       </w:r>
       <w:r>
@@ -96,15 +101,20 @@
       <w:r>
         <w:rPr>
           <w:b/>
+          <w:sz w:val="20"/>
         </w:rPr>
         <w:t xml:space="preserve">Автор: </w:t>
       </w:r>
       <w:r>
+        <w:rPr>
+          <w:sz w:val="20"/>
+        </w:rPr>
         <w:t>Иванов</w:t>
       </w:r>
     </w:p>
     <w:p>
       <w:pPr>
+        <w:keepNext/>
         <w:keepLines/>
         <w:spacing w:before="360"/>
       </w:pPr>
@@ -114,20 +124,65 @@
         </w:rPr>
         <w:t xml:space="preserve">Вопрос 2. </w:t>
       </w:r>
-      <w:r>
-        <w:br/>
-        <w:t xml:space="preserve">[Раздаточный материал: </w:t>
-      </w:r>
-      <w:r>
-        <w:t>Ро-шам-бо</w:t>
-      </w:r>
-      <w:r>
-        <w:br/>
-        <w:t>]</w:t>
-      </w:r>
-      <w:r>
-        <w:br/>
-      </w:r>
+    </w:p>
+    <w:tbl>
+      <w:tblPr>
+        <w:tblW w:type="pct" w:w="5000"/>
+        <w:tblLook w:firstColumn="1" w:firstRow="1" w:lastColumn="0" w:lastRow="0" w:noHBand="0" w:noVBand="1" w:val="04A0"/>
+      </w:tblPr>
+      <w:tblGrid>
+        <w:gridCol w:w="9746"/>
+      </w:tblGrid>
+      <w:tr>
+        <w:tc>
+          <w:tcPr>
+            <w:tcW w:type="dxa" w:w="9746"/>
+            <w:tcMar>
+              <w:top w:w="0" w:type="dxa"/>
+              <w:bottom w:w="20" w:type="dxa"/>
+            </w:tcMar>
+          </w:tcPr>
+          <w:p>
+            <w:pPr>
+              <w:keepNext/>
+            </w:pPr>
+            <w:r>
+              <w:rPr>
+                <w:sz w:val="20"/>
+              </w:rPr>
+              <w:t>Раздаточный материал</w:t>
+            </w:r>
+          </w:p>
+        </w:tc>
+      </w:tr>
+      <w:tr>
+        <w:tc>
+          <w:tcPr>
+            <w:tcW w:type="dxa" w:w="9746"/>
+            <w:tcBorders>
+              <w:top w:val="single" w:sz="8" w:space="0" w:color="000000"/>
+              <w:left w:val="single" w:sz="8" w:space="0" w:color="000000"/>
+              <w:bottom w:val="single" w:sz="8" w:space="0" w:color="000000"/>
+              <w:right w:val="single" w:sz="8" w:space="0" w:color="000000"/>
+            </w:tcBorders>
+            <w:tcMar>
+              <w:top w:w="100" w:type="dxa"/>
+              <w:bottom w:w="100" w:type="dxa"/>
+            </w:tcMar>
+          </w:tcPr>
+          <w:p>
+            <w:r>
+              <w:t>Ро-шам-бо</w:t>
+            </w:r>
+          </w:p>
+        </w:tc>
+      </w:tr>
+    </w:tbl>
+    <w:p>
+      <w:pPr>
+        <w:keepLines/>
+        <w:spacing w:before="120"/>
+      </w:pPr>
       <w:r>
         <w:t>Вопрос с раздаткой</w:t>
       </w:r>
@@ -639,7 +694,7 @@
       <w:jc w:val="left"/>
     </w:pPr>
     <w:rPr>
-      <w:rFonts w:ascii="Arial" w:hAnsi="Arial" w:eastAsia="" w:cs="Times New Roman" w:eastAsiaTheme="minorEastAsia"/>
+      <w:rFonts w:ascii="Noto Sans" w:hAnsi="Noto Sans" w:eastAsia="" w:cs="Times New Roman" w:eastAsiaTheme="minorEastAsia"/>
       <w:color w:val="auto"/>
       <w:kern w:val="0"/>
       <w:sz w:val="24"/>
@@ -661,7 +716,7 @@
       <w:outlineLvl w:val="0"/>
     </w:pPr>
     <w:rPr>
-      <w:rFonts w:ascii="Arial" w:hAnsi="Arial" w:eastAsia="" w:asciiTheme="majorHAnsi" w:eastAsiaTheme="majorEastAsia" w:hAnsiTheme="majorHAnsi"/>
+      <w:rFonts w:ascii="Noto Sans" w:hAnsi="Noto Sans" w:eastAsia="" w:asciiTheme="majorHAnsi" w:eastAsiaTheme="majorEastAsia" w:hAnsiTheme="majorHAnsi"/>
       <w:b/>
       <w:bCs/>
       <w:kern w:val="2"/>
@@ -685,7 +740,7 @@
       <w:outlineLvl w:val="1"/>
     </w:pPr>
     <w:rPr>
-      <w:rFonts w:ascii="Arial" w:hAnsi="Arial" w:eastAsia="" w:asciiTheme="majorHAnsi" w:eastAsiaTheme="majorEastAsia" w:hAnsiTheme="majorHAnsi"/>
+      <w:rFonts w:ascii="Noto Sans" w:hAnsi="Noto Sans" w:eastAsia="" w:asciiTheme="majorHAnsi" w:eastAsiaTheme="majorEastAsia" w:hAnsiTheme="majorHAnsi"/>
       <w:b/>
       <w:bCs/>
       <w:i/>
@@ -710,7 +765,7 @@
       <w:outlineLvl w:val="2"/>
     </w:pPr>
     <w:rPr>
-      <w:rFonts w:ascii="Arial" w:hAnsi="Arial" w:eastAsia="" w:asciiTheme="majorHAnsi" w:eastAsiaTheme="majorEastAsia" w:hAnsiTheme="majorHAnsi"/>
+      <w:rFonts w:ascii="Noto Sans" w:hAnsi="Noto Sans" w:eastAsia="" w:asciiTheme="majorHAnsi" w:eastAsiaTheme="majorEastAsia" w:hAnsiTheme="majorHAnsi"/>
       <w:b/>
       <w:bCs/>
       <w:sz w:val="26"/>
@@ -833,7 +888,7 @@
       <w:outlineLvl w:val="8"/>
     </w:pPr>
     <w:rPr>
-      <w:rFonts w:ascii="Arial" w:hAnsi="Arial" w:eastAsia="" w:asciiTheme="majorHAnsi" w:eastAsiaTheme="majorEastAsia" w:hAnsiTheme="majorHAnsi"/>
+      <w:rFonts w:ascii="Noto Sans" w:hAnsi="Noto Sans" w:eastAsia="" w:asciiTheme="majorHAnsi" w:eastAsiaTheme="majorEastAsia" w:hAnsiTheme="majorHAnsi"/>
       <w:sz w:val="22"/>
       <w:szCs w:val="22"/>
     </w:rPr>
@@ -854,7 +909,7 @@
     <w:qFormat/>
     <w:rsid w:val="003c7a06"/>
     <w:rPr>
-      <w:rFonts w:ascii="Arial" w:hAnsi="Arial" w:eastAsia="" w:asciiTheme="majorHAnsi" w:eastAsiaTheme="majorEastAsia" w:hAnsiTheme="majorHAnsi"/>
+      <w:rFonts w:ascii="Noto Sans" w:hAnsi="Noto Sans" w:eastAsia="" w:asciiTheme="majorHAnsi" w:eastAsiaTheme="majorEastAsia" w:hAnsiTheme="majorHAnsi"/>
       <w:b/>
       <w:bCs/>
       <w:kern w:val="2"/>
@@ -871,7 +926,7 @@
     <w:qFormat/>
     <w:rsid w:val="003c7a06"/>
     <w:rPr>
-      <w:rFonts w:ascii="Arial" w:hAnsi="Arial" w:eastAsia="" w:asciiTheme="majorHAnsi" w:eastAsiaTheme="majorEastAsia" w:hAnsiTheme="majorHAnsi"/>
+      <w:rFonts w:ascii="Noto Sans" w:hAnsi="Noto Sans" w:eastAsia="" w:asciiTheme="majorHAnsi" w:eastAsiaTheme="majorEastAsia" w:hAnsiTheme="majorHAnsi"/>
       <w:b/>
       <w:bCs/>
       <w:i/>
@@ -889,7 +944,7 @@
     <w:qFormat/>
     <w:rsid w:val="003c7a06"/>
     <w:rPr>
-      <w:rFonts w:ascii="Arial" w:hAnsi="Arial" w:eastAsia="" w:asciiTheme="majorHAnsi" w:eastAsiaTheme="majorEastAsia" w:hAnsiTheme="majorHAnsi"/>
+      <w:rFonts w:ascii="Noto Sans" w:hAnsi="Noto Sans" w:eastAsia="" w:asciiTheme="majorHAnsi" w:eastAsiaTheme="majorEastAsia" w:hAnsiTheme="majorHAnsi"/>
       <w:b/>
       <w:bCs/>
       <w:sz w:val="26"/>
@@ -978,7 +1033,7 @@
     <w:qFormat/>
     <w:rsid w:val="003c7a06"/>
     <w:rPr>
-      <w:rFonts w:ascii="Arial" w:hAnsi="Arial" w:eastAsia="" w:asciiTheme="majorHAnsi" w:eastAsiaTheme="majorEastAsia" w:hAnsiTheme="majorHAnsi"/>
+      <w:rFonts w:ascii="Noto Sans" w:hAnsi="Noto Sans" w:eastAsia="" w:asciiTheme="majorHAnsi" w:eastAsiaTheme="majorEastAsia" w:hAnsiTheme="majorHAnsi"/>
     </w:rPr>
   </w:style>
   <w:style w:type="character" w:styleId="TitleChar" w:customStyle="1">
@@ -989,7 +1044,7 @@
     <w:qFormat/>
     <w:rsid w:val="003c7a06"/>
     <w:rPr>
-      <w:rFonts w:ascii="Arial" w:hAnsi="Arial" w:eastAsia="" w:asciiTheme="majorHAnsi" w:eastAsiaTheme="majorEastAsia" w:hAnsiTheme="majorHAnsi"/>
+      <w:rFonts w:ascii="Noto Sans" w:hAnsi="Noto Sans" w:eastAsia="" w:asciiTheme="majorHAnsi" w:eastAsiaTheme="majorEastAsia" w:hAnsiTheme="majorHAnsi"/>
       <w:b/>
       <w:bCs/>
       <w:kern w:val="2"/>
@@ -1005,7 +1060,7 @@
     <w:qFormat/>
     <w:rsid w:val="003c7a06"/>
     <w:rPr>
-      <w:rFonts w:ascii="Arial" w:hAnsi="Arial" w:eastAsia="" w:asciiTheme="majorHAnsi" w:eastAsiaTheme="majorEastAsia" w:hAnsiTheme="majorHAnsi"/>
+      <w:rFonts w:ascii="Noto Sans" w:hAnsi="Noto Sans" w:eastAsia="" w:asciiTheme="majorHAnsi" w:eastAsiaTheme="majorEastAsia" w:hAnsiTheme="majorHAnsi"/>
       <w:sz w:val="24"/>
       <w:szCs w:val="24"/>
     </w:rPr>
@@ -1115,7 +1170,7 @@
     <w:qFormat/>
     <w:rsid w:val="003c7a06"/>
     <w:rPr>
-      <w:rFonts w:ascii="Arial" w:hAnsi="Arial" w:eastAsia="" w:asciiTheme="majorHAnsi" w:eastAsiaTheme="majorEastAsia" w:hAnsiTheme="majorHAnsi"/>
+      <w:rFonts w:ascii="Noto Sans" w:hAnsi="Noto Sans" w:eastAsia="" w:asciiTheme="majorHAnsi" w:eastAsiaTheme="majorEastAsia" w:hAnsiTheme="majorHAnsi"/>
       <w:b/>
       <w:i/>
       <w:sz w:val="24"/>
@@ -1179,7 +1234,7 @@
       <w:spacing w:before="240" w:after="120"/>
     </w:pPr>
     <w:rPr>
-      <w:rFonts w:ascii="Liberation Sans" w:hAnsi="Liberation Sans" w:eastAsia="PingFang SC" w:cs="Arial Unicode MS"/>
+      <w:rFonts w:ascii="Liberation Sans" w:hAnsi="Liberation Sans" w:eastAsia="PingFang SC" w:cs="Noto Sans"/>
       <w:sz w:val="28"/>
       <w:szCs w:val="28"/>
     </w:rPr>
@@ -1197,7 +1252,7 @@
     <w:basedOn w:val="TextBody"/>
     <w:pPr/>
     <w:rPr>
-      <w:rFonts w:cs="Arial Unicode MS"/>
+      <w:rFonts w:cs="Noto Sans"/>
     </w:rPr>
   </w:style>
   <w:style w:type="paragraph" w:styleId="Caption">
@@ -1209,7 +1264,7 @@
       <w:spacing w:before="120" w:after="120"/>
     </w:pPr>
     <w:rPr>
-      <w:rFonts w:cs="Arial Unicode MS"/>
+      <w:rFonts w:cs="Noto Sans"/>
       <w:i/>
       <w:iCs/>
       <w:sz w:val="24"/>
@@ -1224,7 +1279,7 @@
       <w:suppressLineNumbers/>
     </w:pPr>
     <w:rPr>
-      <w:rFonts w:cs="Arial Unicode MS"/>
+      <w:rFonts w:cs="Noto Sans"/>
     </w:rPr>
   </w:style>
   <w:style w:type="paragraph" w:styleId="Title">
@@ -1241,7 +1296,7 @@
       <w:outlineLvl w:val="0"/>
     </w:pPr>
     <w:rPr>
-      <w:rFonts w:ascii="Arial" w:hAnsi="Arial" w:eastAsia="" w:asciiTheme="majorHAnsi" w:eastAsiaTheme="majorEastAsia" w:hAnsiTheme="majorHAnsi"/>
+      <w:rFonts w:ascii="Noto Sans" w:hAnsi="Noto Sans" w:eastAsia="" w:asciiTheme="majorHAnsi" w:eastAsiaTheme="majorEastAsia" w:hAnsiTheme="majorHAnsi"/>
       <w:b/>
       <w:bCs/>
       <w:kern w:val="2"/>
@@ -1263,7 +1318,7 @@
       <w:outlineLvl w:val="1"/>
     </w:pPr>
     <w:rPr>
-      <w:rFonts w:ascii="Arial" w:hAnsi="Arial" w:eastAsia="" w:asciiTheme="majorHAnsi" w:eastAsiaTheme="majorEastAsia" w:hAnsiTheme="majorHAnsi"/>
+      <w:rFonts w:ascii="Noto Sans" w:hAnsi="Noto Sans" w:eastAsia="" w:asciiTheme="majorHAnsi" w:eastAsiaTheme="majorEastAsia" w:hAnsiTheme="majorHAnsi"/>
     </w:rPr>
   </w:style>
   <w:style w:type="paragraph" w:styleId="NoSpacing">
@@ -1464,15 +1519,15 @@
     </a:clrScheme>
     <a:fontScheme name="Классическая">
       <a:majorFont>
-        <a:latin typeface="Arial"/>
+        <a:latin typeface="Noto Sans"/>
         <a:ea typeface=""/>
         <a:cs typeface=""/>
         <a:font script="Jpan" typeface="ＭＳ Ｐゴシック"/>
         <a:font script="Hang" typeface="돋움"/>
         <a:font script="Hans" typeface="黑体"/>
         <a:font script="Hant" typeface="微軟正黑體"/>
-        <a:font script="Arab" typeface="Arial"/>
-        <a:font script="Hebr" typeface="Arial"/>
+        <a:font script="Arab" typeface="Noto Sans"/>
+        <a:font script="Hebr" typeface="Noto Sans"/>
         <a:font script="Thai" typeface="Cordia New"/>
         <a:font script="Ethi" typeface="Nyala"/>
         <a:font script="Beng" typeface="Vrinda"/>
@@ -1494,7 +1549,7 @@
         <a:font script="Laoo" typeface="DokChampa"/>
         <a:font script="Sinh" typeface="Iskoola Pota"/>
         <a:font script="Mong" typeface="Mongolian Baiti"/>
-        <a:font script="Viet" typeface="Arial"/>
+        <a:font script="Viet" typeface="Noto Sans"/>
         <a:font script="Uigh" typeface="Microsoft Uighur"/>
         <a:font script="Geor" typeface="Sylfaen"/>
       </a:majorFont>

</xml_diff>

<commit_message>
chgk, xy: a one-line handout gets a frame only as wide as it, centred
Ports chgksuite e1364e5. A handout of one line gets a box as wide as it or its
caption, whichever is wider, and sits centred in it; a longer one keeps the
full width. The caption starts at the frame's left edge.

typst sizes this itself (an auto grid column, the caption its header) and so
does the browser (fit-content). The docx exporter measures the line in Noto
Sans Regular from the font's own advances, the integers chgksuite's Pillow
measurement reports, so the oracles stay byte-identical.

Co-Authored-By: Claude Opus 5.5 <noreply@anthropic.com>
</commit_message>
<xml_diff>
--- a/xy/internal/chgk/docx/testdata/basic.docx
+++ b/xy/internal/chgk/docx/testdata/basic.docx
@@ -127,18 +127,20 @@
     </w:p>
     <w:tbl>
       <w:tblPr>
-        <w:tblW w:type="pct" w:w="5000"/>
+        <w:tblW w:type="dxa" w:w="2408"/>
+        <w:tblLayout w:type="fixed"/>
         <w:tblLook w:firstColumn="1" w:firstRow="1" w:lastColumn="0" w:lastRow="0" w:noHBand="0" w:noVBand="1" w:val="04A0"/>
       </w:tblPr>
       <w:tblGrid>
-        <w:gridCol w:w="9746"/>
+        <w:gridCol w:w="2408"/>
       </w:tblGrid>
       <w:tr>
         <w:tc>
           <w:tcPr>
-            <w:tcW w:type="dxa" w:w="9746"/>
+            <w:tcW w:type="dxa" w:w="2408"/>
             <w:tcMar>
               <w:top w:w="0" w:type="dxa"/>
+              <w:left w:w="0" w:type="dxa"/>
               <w:bottom w:w="20" w:type="dxa"/>
             </w:tcMar>
           </w:tcPr>
@@ -158,7 +160,7 @@
       <w:tr>
         <w:tc>
           <w:tcPr>
-            <w:tcW w:type="dxa" w:w="9746"/>
+            <w:tcW w:type="dxa" w:w="2408"/>
             <w:tcBorders>
               <w:top w:val="single" w:sz="8" w:space="0" w:color="000000"/>
               <w:left w:val="single" w:sz="8" w:space="0" w:color="000000"/>
@@ -171,6 +173,9 @@
             </w:tcMar>
           </w:tcPr>
           <w:p>
+            <w:pPr>
+              <w:jc w:val="center"/>
+            </w:pPr>
             <w:r>
               <w:t>Ро-шам-бо</w:t>
             </w:r>

</xml_diff>